<commit_message>
Add selected edited portrait to two-column resume
</commit_message>
<xml_diff>
--- a/assets/resume/shi-jiawen-ai-product-resume-two-column-20261012.docx
+++ b/assets/resume/shi-jiawen-ai-product-resume-two-column-20261012.docx
@@ -359,9 +359,8 @@
           </w:p>
           <w:p>
             <w:pPr>
-              <w:keepNext w:val="0"/>
-              <w:keepLines/>
-              <w:spacing w:before="0" w:after="0" w:line="3855" w:lineRule="exact"/>
+              <w:spacing w:before="0" w:after="40" w:line="240" w:lineRule="auto"/>
+              <w:jc w:val="center"/>
             </w:pPr>
             <w:r>
               <w:rPr>
@@ -371,6 +370,38 @@
                 <w:color w:val="161412"/>
                 <w:sz w:val="2"/>
               </w:rPr>
+              <w:drawing>
+                <wp:inline xmlns:a="http://schemas.openxmlformats.org/drawingml/2006/main" xmlns:pic="http://schemas.openxmlformats.org/drawingml/2006/picture">
+                  <wp:extent cx="1944000" cy="2430000"/>
+                  <wp:docPr id="1" name="Picture 1"/>
+                  <wp:cNvGraphicFramePr>
+                    <a:graphicFrameLocks noChangeAspect="1"/>
+                  </wp:cNvGraphicFramePr>
+                  <a:graphic>
+                    <a:graphicData uri="http://schemas.openxmlformats.org/drawingml/2006/picture">
+                      <pic:pic>
+                        <pic:nvPicPr>
+                          <pic:cNvPr id="0" name="shi-jiawen-portrait-bw-20261012.png"/>
+                          <pic:cNvPicPr/>
+                        </pic:nvPicPr>
+                        <pic:blipFill>
+                          <a:blip r:embed="rId13"/>
+                          <a:stretch>
+                            <a:fillRect/>
+                          </a:stretch>
+                        </pic:blipFill>
+                        <pic:spPr>
+                          <a:xfrm>
+                            <a:off x="0" y="0"/>
+                            <a:ext cx="1944000" cy="2430000"/>
+                          </a:xfrm>
+                          <a:prstGeom prst="rect"/>
+                        </pic:spPr>
+                      </pic:pic>
+                    </a:graphicData>
+                  </a:graphic>
+                </wp:inline>
+              </w:drawing>
             </w:r>
           </w:p>
           <w:p>
@@ -1685,7 +1716,7 @@
                       <w:sz w:val="22"/>
                     </w:rPr>
                   </w:r>
-                  <w:hyperlink r:id="rId13">
+                  <w:hyperlink r:id="rId14">
                     <w:r>
                       <w:rPr>
                         <w:rFonts w:ascii="Arial" w:hAnsi="Arial" w:eastAsia="Microsoft YaHei"/>
@@ -1729,7 +1760,7 @@
                       <w:sz w:val="22"/>
                     </w:rPr>
                   </w:r>
-                  <w:hyperlink r:id="rId14">
+                  <w:hyperlink r:id="rId15">
                     <w:r>
                       <w:rPr>
                         <w:rFonts w:ascii="Arial" w:hAnsi="Arial" w:eastAsia="Microsoft YaHei"/>
@@ -2286,7 +2317,7 @@
                 <w:sz w:val="22"/>
               </w:rPr>
             </w:r>
-            <w:hyperlink r:id="rId15">
+            <w:hyperlink r:id="rId16">
               <w:r>
                 <w:rPr>
                   <w:rFonts w:ascii="Arial" w:hAnsi="Arial" w:eastAsia="Microsoft YaHei"/>
@@ -2494,7 +2525,7 @@
                 <w:sz w:val="22"/>
               </w:rPr>
             </w:r>
-            <w:hyperlink r:id="rId16">
+            <w:hyperlink r:id="rId17">
               <w:r>
                 <w:rPr>
                   <w:rFonts w:ascii="Arial" w:hAnsi="Arial" w:eastAsia="Microsoft YaHei"/>
@@ -2665,7 +2696,7 @@
                 <w:sz w:val="22"/>
               </w:rPr>
             </w:r>
-            <w:hyperlink r:id="rId17">
+            <w:hyperlink r:id="rId18">
               <w:r>
                 <w:rPr>
                   <w:rFonts w:ascii="Arial" w:hAnsi="Arial" w:eastAsia="Microsoft YaHei"/>
@@ -2847,7 +2878,7 @@
     </w:tbl>
     <w:sectPr>
       <w:headerReference w:type="default" r:id="rId9"/>
-      <w:footerReference w:type="default" r:id="rId18"/>
+      <w:footerReference w:type="default" r:id="rId19"/>
       <w:pgSz w:w="11906" w:h="16838"/>
       <w:pgMar w:top="680" w:right="680" w:bottom="737" w:left="680" w:header="0" w:footer="283" w:gutter="0"/>
       <w:cols w:space="720"/>

</xml_diff>